<commit_message>
Add Q5 comparison of Cat & Gray Wolf Swarm Optimizations with Particle Swarm Optimization
</commit_message>
<xml_diff>
--- a/Q5_swarm_algorithms.docx
+++ b/Q5_swarm_algorithms.docx
@@ -12,8 +12,6 @@
         <w:spacing w:after="0" w:line="240" w:lineRule="auto"/>
         <w:ind w:left="-115"/>
         <w:jc w:val="left"/>
-      </w:pPr>
-      <w:r>
         <w:rPr>
           <w:rFonts w:ascii="Aptos" w:hAnsi="Aptos" w:eastAsia="Aptos" w:cs="Aptos"/>
           <w:b w:val="1"/>
@@ -28,11 +26,19 @@
           <w:szCs w:val="36"/>
           <w:lang w:val="en-GB"/>
         </w:rPr>
-        <w:t>Data Structures and Algorithms 2</w:t>
-      </w:r>
-      <w:r>
-        <w:br/>
-      </w:r>
+      </w:pPr>
+    </w:p>
+    <w:p>
+      <w:pPr>
+        <w:pStyle w:val="Header"/>
+        <w:tabs>
+          <w:tab w:val="center" w:leader="none" w:pos="4680"/>
+          <w:tab w:val="right" w:leader="none" w:pos="9360"/>
+        </w:tabs>
+        <w:spacing w:after="0" w:line="240" w:lineRule="auto"/>
+        <w:ind w:left="-115"/>
+        <w:jc w:val="left"/>
+      </w:pPr>
       <w:r>
         <w:rPr>
           <w:rFonts w:ascii="Aptos" w:hAnsi="Aptos" w:eastAsia="Aptos" w:cs="Aptos"/>
@@ -44,11 +50,14 @@
           <w:smallCaps w:val="0"/>
           <w:noProof w:val="0"/>
           <w:color w:val="000000" w:themeColor="text1" w:themeTint="FF" w:themeShade="FF"/>
-          <w:sz w:val="24"/>
-          <w:szCs w:val="24"/>
-          <w:lang w:val="en-GB"/>
-        </w:rPr>
-        <w:t xml:space="preserve">Question </w:t>
+          <w:sz w:val="36"/>
+          <w:szCs w:val="36"/>
+          <w:lang w:val="en-GB"/>
+        </w:rPr>
+        <w:t>Data Structures and Algorithms 2</w:t>
+      </w:r>
+      <w:r>
+        <w:br/>
       </w:r>
       <w:r>
         <w:rPr>
@@ -65,7 +74,7 @@
           <w:szCs w:val="24"/>
           <w:lang w:val="en-GB"/>
         </w:rPr>
-        <w:t>5</w:t>
+        <w:t xml:space="preserve">Question </w:t>
       </w:r>
       <w:r>
         <w:rPr>
@@ -82,22 +91,7 @@
           <w:szCs w:val="24"/>
           <w:lang w:val="en-GB"/>
         </w:rPr>
-        <w:t xml:space="preserve">: </w:t>
-      </w:r>
-      <w:r>
-        <w:rPr>
-          <w:b w:val="1"/>
-          <w:bCs w:val="1"/>
-          <w:noProof w:val="0"/>
-          <w:lang w:val="en-GB"/>
-        </w:rPr>
-        <w:t>Swarm Algorithms</w:t>
-      </w:r>
-      <w:r>
-        <w:br/>
-      </w:r>
-      <w:r>
-        <w:br/>
+        <w:t>5</w:t>
       </w:r>
       <w:r>
         <w:rPr>
@@ -114,9 +108,41 @@
           <w:szCs w:val="24"/>
           <w:lang w:val="en-GB"/>
         </w:rPr>
+        <w:t xml:space="preserve">: </w:t>
+      </w:r>
+      <w:r>
+        <w:rPr>
+          <w:b w:val="1"/>
+          <w:bCs w:val="1"/>
+          <w:noProof w:val="0"/>
+          <w:lang w:val="en-GB"/>
+        </w:rPr>
+        <w:t>Swarm Algorithms</w:t>
+      </w:r>
+      <w:r>
+        <w:br/>
+      </w:r>
+      <w:r>
+        <w:br/>
+      </w:r>
+      <w:r>
+        <w:rPr>
+          <w:rFonts w:ascii="Aptos" w:hAnsi="Aptos" w:eastAsia="Aptos" w:cs="Aptos"/>
+          <w:b w:val="1"/>
+          <w:bCs w:val="1"/>
+          <w:i w:val="0"/>
+          <w:iCs w:val="0"/>
+          <w:caps w:val="0"/>
+          <w:smallCaps w:val="0"/>
+          <w:noProof w:val="0"/>
+          <w:color w:val="000000" w:themeColor="text1" w:themeTint="FF" w:themeShade="FF"/>
+          <w:sz w:val="24"/>
+          <w:szCs w:val="24"/>
+          <w:lang w:val="en-GB"/>
+        </w:rPr>
         <w:t xml:space="preserve">GitHub repository: </w:t>
       </w:r>
-      <w:hyperlink r:id="R8aa74fc7ef0d4fc4">
+      <w:hyperlink r:id="Raf9b7eade1bb4762">
         <w:r>
           <w:rPr>
             <w:rStyle w:val="Hyperlink"/>
@@ -266,7 +292,21 @@
           <w:noProof w:val="0"/>
           <w:lang w:val="en-GB"/>
         </w:rPr>
-        <w:t>b) Both articles compare their models with other, pre-existing models. Choose one pre-existing model they have in common and compare both models’ results against it.</w:t>
+        <w:t>b) Both articles compare their models with other, pre-existing models. Choose one pre-</w:t>
+      </w:r>
+      <w:r>
+        <w:rPr>
+          <w:noProof w:val="0"/>
+          <w:lang w:val="en-GB"/>
+        </w:rPr>
+        <w:t>existing</w:t>
+      </w:r>
+      <w:r>
+        <w:rPr>
+          <w:noProof w:val="0"/>
+          <w:lang w:val="en-GB"/>
+        </w:rPr>
+        <w:t xml:space="preserve"> model they have in common and compare both models’ results against it.</w:t>
       </w:r>
     </w:p>
     <w:p>
@@ -1163,13 +1203,1097 @@
         <w:t xml:space="preserve">. </w:t>
       </w:r>
     </w:p>
+    <w:p>
+      <w:pPr>
+        <w:pStyle w:val="Header"/>
+        <w:tabs>
+          <w:tab w:val="center" w:leader="none" w:pos="4680"/>
+          <w:tab w:val="right" w:leader="none" w:pos="9360"/>
+        </w:tabs>
+        <w:spacing w:after="0" w:line="240" w:lineRule="auto"/>
+        <w:ind w:left="-115"/>
+        <w:jc w:val="left"/>
+        <w:rPr>
+          <w:b w:val="1"/>
+          <w:bCs w:val="1"/>
+          <w:noProof w:val="0"/>
+          <w:u w:val="single"/>
+          <w:lang w:val="en-GB"/>
+        </w:rPr>
+      </w:pPr>
+    </w:p>
+    <w:p>
+      <w:pPr>
+        <w:pStyle w:val="Header"/>
+        <w:tabs>
+          <w:tab w:val="center" w:leader="none" w:pos="4680"/>
+          <w:tab w:val="right" w:leader="none" w:pos="9360"/>
+        </w:tabs>
+        <w:spacing w:after="0" w:line="240" w:lineRule="auto"/>
+        <w:ind w:left="-115"/>
+        <w:jc w:val="left"/>
+      </w:pPr>
+      <w:r>
+        <w:rPr>
+          <w:b w:val="1"/>
+          <w:bCs w:val="1"/>
+          <w:noProof w:val="0"/>
+          <w:u w:val="single"/>
+          <w:lang w:val="en-GB"/>
+        </w:rPr>
+        <w:t>Q5(b): Comparison against Particle Swarm Optimization</w:t>
+      </w:r>
+    </w:p>
+    <w:p>
+      <w:pPr>
+        <w:pStyle w:val="Header"/>
+        <w:tabs>
+          <w:tab w:val="center" w:leader="none" w:pos="4680"/>
+          <w:tab w:val="right" w:leader="none" w:pos="9360"/>
+        </w:tabs>
+        <w:spacing w:after="0" w:line="240" w:lineRule="auto"/>
+        <w:ind w:left="-115"/>
+        <w:jc w:val="left"/>
+        <w:rPr>
+          <w:noProof w:val="0"/>
+          <w:sz w:val="20"/>
+          <w:szCs w:val="20"/>
+          <w:lang w:val="en-GB"/>
+        </w:rPr>
+      </w:pPr>
+    </w:p>
+    <w:p>
+      <w:pPr>
+        <w:pStyle w:val="Header"/>
+        <w:tabs>
+          <w:tab w:val="center" w:leader="none" w:pos="4680"/>
+          <w:tab w:val="right" w:leader="none" w:pos="9360"/>
+        </w:tabs>
+        <w:spacing w:after="0" w:line="240" w:lineRule="auto"/>
+        <w:ind w:left="-115"/>
+        <w:jc w:val="left"/>
+      </w:pPr>
+      <w:r>
+        <w:rPr>
+          <w:noProof w:val="0"/>
+          <w:sz w:val="20"/>
+          <w:szCs w:val="20"/>
+          <w:lang w:val="en-GB"/>
+        </w:rPr>
+        <w:t>Both papers compare their algorithm with the Particle Swarm Optimization so for comparison I use this as the common algorithm and compare how well each method finds solutions in the reported tests.</w:t>
+      </w:r>
+      <w:r>
+        <w:rPr>
+          <w:noProof w:val="0"/>
+          <w:sz w:val="20"/>
+          <w:szCs w:val="20"/>
+          <w:lang w:val="en-GB"/>
+        </w:rPr>
+        <w:t xml:space="preserve"> Chu, </w:t>
+      </w:r>
+      <w:r>
+        <w:rPr>
+          <w:noProof w:val="0"/>
+          <w:sz w:val="20"/>
+          <w:szCs w:val="20"/>
+          <w:lang w:val="en-GB"/>
+        </w:rPr>
+        <w:t>Tsai</w:t>
+      </w:r>
+      <w:r>
+        <w:rPr>
+          <w:noProof w:val="0"/>
+          <w:sz w:val="20"/>
+          <w:szCs w:val="20"/>
+          <w:lang w:val="en-GB"/>
+        </w:rPr>
+        <w:t xml:space="preserve"> and Pan (2006) compared </w:t>
+      </w:r>
+      <w:r>
+        <w:rPr>
+          <w:noProof w:val="0"/>
+          <w:sz w:val="20"/>
+          <w:szCs w:val="20"/>
+          <w:lang w:val="en-GB"/>
+        </w:rPr>
+        <w:t>the Cat Swarm Optimization</w:t>
+      </w:r>
+      <w:r>
+        <w:rPr>
+          <w:noProof w:val="0"/>
+          <w:sz w:val="20"/>
+          <w:szCs w:val="20"/>
+          <w:lang w:val="en-GB"/>
+        </w:rPr>
+        <w:t xml:space="preserve"> with two versions of P</w:t>
+      </w:r>
+      <w:r>
+        <w:rPr>
+          <w:noProof w:val="0"/>
+          <w:sz w:val="20"/>
+          <w:szCs w:val="20"/>
+          <w:lang w:val="en-GB"/>
+        </w:rPr>
+        <w:t>article Swarm</w:t>
+      </w:r>
+      <w:r>
+        <w:rPr>
+          <w:noProof w:val="0"/>
+          <w:sz w:val="20"/>
+          <w:szCs w:val="20"/>
+          <w:lang w:val="en-GB"/>
+        </w:rPr>
+        <w:t xml:space="preserve"> </w:t>
+      </w:r>
+      <w:r>
+        <w:rPr>
+          <w:noProof w:val="0"/>
+          <w:sz w:val="20"/>
+          <w:szCs w:val="20"/>
+          <w:lang w:val="en-GB"/>
+        </w:rPr>
+        <w:t>Optimization</w:t>
+      </w:r>
+      <w:r>
+        <w:rPr>
+          <w:noProof w:val="0"/>
+          <w:sz w:val="20"/>
+          <w:szCs w:val="20"/>
+          <w:lang w:val="en-GB"/>
+        </w:rPr>
+        <w:t xml:space="preserve"> using six test functions and they report</w:t>
+      </w:r>
+      <w:r>
+        <w:rPr>
+          <w:noProof w:val="0"/>
+          <w:sz w:val="20"/>
+          <w:szCs w:val="20"/>
+          <w:lang w:val="en-GB"/>
+        </w:rPr>
+        <w:t>ed</w:t>
+      </w:r>
+      <w:r>
+        <w:rPr>
+          <w:noProof w:val="0"/>
+          <w:sz w:val="20"/>
+          <w:szCs w:val="20"/>
+          <w:lang w:val="en-GB"/>
+        </w:rPr>
+        <w:t xml:space="preserve"> that </w:t>
+      </w:r>
+      <w:r>
+        <w:rPr>
+          <w:noProof w:val="0"/>
+          <w:sz w:val="20"/>
+          <w:szCs w:val="20"/>
+          <w:lang w:val="en-GB"/>
+        </w:rPr>
+        <w:t>the Cat Swarm</w:t>
+      </w:r>
+      <w:r>
+        <w:rPr>
+          <w:noProof w:val="0"/>
+          <w:sz w:val="20"/>
+          <w:szCs w:val="20"/>
+          <w:lang w:val="en-GB"/>
+        </w:rPr>
+        <w:t xml:space="preserve"> found better solutions than both P</w:t>
+      </w:r>
+      <w:r>
+        <w:rPr>
+          <w:noProof w:val="0"/>
+          <w:sz w:val="20"/>
+          <w:szCs w:val="20"/>
+          <w:lang w:val="en-GB"/>
+        </w:rPr>
+        <w:t xml:space="preserve">article Swarm </w:t>
+      </w:r>
+      <w:r>
+        <w:rPr>
+          <w:noProof w:val="0"/>
+          <w:sz w:val="20"/>
+          <w:szCs w:val="20"/>
+          <w:lang w:val="en-GB"/>
+        </w:rPr>
+        <w:t>versions</w:t>
+      </w:r>
+      <w:r>
+        <w:rPr>
+          <w:noProof w:val="0"/>
+          <w:sz w:val="20"/>
+          <w:szCs w:val="20"/>
+          <w:lang w:val="en-GB"/>
+        </w:rPr>
+        <w:t xml:space="preserve">. </w:t>
+      </w:r>
+      <w:r>
+        <w:rPr>
+          <w:noProof w:val="0"/>
+          <w:sz w:val="20"/>
+          <w:szCs w:val="20"/>
+          <w:lang w:val="en-GB"/>
+        </w:rPr>
+        <w:t>However, they only show a results graph for one test</w:t>
+      </w:r>
+      <w:r>
+        <w:rPr>
+          <w:noProof w:val="0"/>
+          <w:sz w:val="20"/>
+          <w:szCs w:val="20"/>
+          <w:lang w:val="en-GB"/>
+        </w:rPr>
+        <w:t xml:space="preserve"> so t</w:t>
+      </w:r>
+      <w:r>
+        <w:rPr>
+          <w:noProof w:val="0"/>
+          <w:sz w:val="20"/>
+          <w:szCs w:val="20"/>
+          <w:lang w:val="en-GB"/>
+        </w:rPr>
+        <w:t xml:space="preserve">his limits how much of the reported improvement </w:t>
+      </w:r>
+      <w:r>
+        <w:rPr>
+          <w:noProof w:val="0"/>
+          <w:sz w:val="20"/>
+          <w:szCs w:val="20"/>
+          <w:lang w:val="en-GB"/>
+        </w:rPr>
+        <w:t>that can be</w:t>
+      </w:r>
+      <w:r>
+        <w:rPr>
+          <w:noProof w:val="0"/>
+          <w:sz w:val="20"/>
+          <w:szCs w:val="20"/>
+          <w:lang w:val="en-GB"/>
+        </w:rPr>
+        <w:t xml:space="preserve"> check</w:t>
+      </w:r>
+      <w:r>
+        <w:rPr>
+          <w:noProof w:val="0"/>
+          <w:sz w:val="20"/>
+          <w:szCs w:val="20"/>
+          <w:lang w:val="en-GB"/>
+        </w:rPr>
+        <w:t>ed</w:t>
+      </w:r>
+      <w:r>
+        <w:rPr>
+          <w:noProof w:val="0"/>
+          <w:sz w:val="20"/>
+          <w:szCs w:val="20"/>
+          <w:lang w:val="en-GB"/>
+        </w:rPr>
+        <w:t>.</w:t>
+      </w:r>
+      <w:r>
+        <w:rPr>
+          <w:noProof w:val="0"/>
+          <w:sz w:val="20"/>
+          <w:szCs w:val="20"/>
+          <w:lang w:val="en-GB"/>
+        </w:rPr>
+        <w:t xml:space="preserve"> </w:t>
+      </w:r>
+      <w:r>
+        <w:rPr>
+          <w:rFonts w:ascii="Aptos" w:hAnsi="Aptos" w:eastAsia="Aptos" w:cs="Aptos"/>
+          <w:noProof w:val="0"/>
+          <w:sz w:val="20"/>
+          <w:szCs w:val="20"/>
+          <w:lang w:val="en-GB"/>
+        </w:rPr>
+        <w:t>Mirjalili, Mirjalili and Lewis (2014) ran the Gray Wolf Optimizer 30 times on each test function, and their results show that it performed better than Particle Swarm on some tests, but the Particle Swarm also performing better on others.</w:t>
+      </w:r>
+    </w:p>
+    <w:p>
+      <w:pPr>
+        <w:pStyle w:val="Normal"/>
+        <w:suppressLineNumbers w:val="0"/>
+        <w:bidi w:val="0"/>
+        <w:spacing w:before="240" w:beforeAutospacing="off" w:after="240" w:afterAutospacing="off" w:line="279" w:lineRule="auto"/>
+        <w:ind w:left="0" w:right="0"/>
+        <w:jc w:val="left"/>
+        <w:rPr>
+          <w:rFonts w:ascii="Aptos" w:hAnsi="Aptos" w:eastAsia="Aptos" w:cs="Aptos"/>
+          <w:noProof w:val="0"/>
+          <w:sz w:val="20"/>
+          <w:szCs w:val="20"/>
+          <w:lang w:val="en-GB"/>
+        </w:rPr>
+      </w:pPr>
+    </w:p>
+    <w:p>
+      <w:pPr>
+        <w:pStyle w:val="Normal"/>
+        <w:suppressLineNumbers w:val="0"/>
+        <w:bidi w:val="0"/>
+        <w:spacing w:before="240" w:beforeAutospacing="off" w:after="240" w:afterAutospacing="off" w:line="279" w:lineRule="auto"/>
+        <w:ind w:left="0" w:right="0"/>
+        <w:jc w:val="left"/>
+        <w:rPr>
+          <w:rFonts w:ascii="Aptos" w:hAnsi="Aptos" w:eastAsia="Aptos" w:cs="Aptos"/>
+          <w:noProof w:val="0"/>
+          <w:sz w:val="20"/>
+          <w:szCs w:val="20"/>
+          <w:lang w:val="en-GB"/>
+        </w:rPr>
+      </w:pPr>
+    </w:p>
+    <w:p>
+      <w:pPr>
+        <w:pStyle w:val="Normal"/>
+        <w:suppressLineNumbers w:val="0"/>
+        <w:bidi w:val="0"/>
+        <w:spacing w:before="240" w:beforeAutospacing="off" w:after="240" w:afterAutospacing="off" w:line="279" w:lineRule="auto"/>
+        <w:ind w:left="0" w:right="0"/>
+        <w:jc w:val="left"/>
+        <w:rPr>
+          <w:rFonts w:ascii="Aptos" w:hAnsi="Aptos" w:eastAsia="Aptos" w:cs="Aptos"/>
+          <w:noProof w:val="0"/>
+          <w:sz w:val="20"/>
+          <w:szCs w:val="20"/>
+          <w:lang w:val="en-GB"/>
+        </w:rPr>
+      </w:pPr>
+    </w:p>
+    <w:tbl>
+      <w:tblPr>
+        <w:tblStyle w:val="TableGrid"/>
+        <w:bidiVisual w:val="0"/>
+        <w:tblW w:w="0" w:type="auto"/>
+        <w:tblLook w:val="06A0" w:firstRow="1" w:lastRow="0" w:firstColumn="1" w:lastColumn="0" w:noHBand="1" w:noVBand="1"/>
+      </w:tblPr>
+      <w:tblGrid>
+        <w:gridCol w:w="2340"/>
+        <w:gridCol w:w="3360"/>
+        <w:gridCol w:w="3687"/>
+      </w:tblGrid>
+      <w:tr>
+        <w:trPr>
+          <w:trHeight w:val="300"/>
+        </w:trPr>
+        <w:tc>
+          <w:tcPr>
+            <w:tcW w:w="2340" w:type="dxa"/>
+            <w:tcMar/>
+          </w:tcPr>
+          <w:p>
+            <w:pPr>
+              <w:bidi w:val="0"/>
+              <w:spacing w:before="0" w:beforeAutospacing="off" w:after="0" w:afterAutospacing="off"/>
+              <w:jc w:val="center"/>
+              <w:rPr>
+                <w:b w:val="1"/>
+                <w:bCs w:val="1"/>
+                <w:sz w:val="20"/>
+                <w:szCs w:val="20"/>
+                <w:u w:val="single"/>
+              </w:rPr>
+            </w:pPr>
+            <w:r>
+              <w:rPr>
+                <w:b w:val="1"/>
+                <w:bCs w:val="1"/>
+                <w:sz w:val="20"/>
+                <w:szCs w:val="20"/>
+                <w:u w:val="single"/>
+              </w:rPr>
+              <w:t>Test function</w:t>
+            </w:r>
+          </w:p>
+        </w:tc>
+        <w:tc>
+          <w:tcPr>
+            <w:tcW w:w="3360" w:type="dxa"/>
+            <w:tcMar/>
+          </w:tcPr>
+          <w:p>
+            <w:pPr>
+              <w:pStyle w:val="Normal"/>
+              <w:suppressLineNumbers w:val="0"/>
+              <w:bidi w:val="0"/>
+              <w:spacing w:before="0" w:beforeAutospacing="off" w:after="0" w:afterAutospacing="off" w:line="279" w:lineRule="auto"/>
+              <w:ind w:left="0" w:right="0"/>
+              <w:jc w:val="center"/>
+              <w:rPr>
+                <w:b w:val="1"/>
+                <w:bCs w:val="1"/>
+                <w:sz w:val="20"/>
+                <w:szCs w:val="20"/>
+                <w:u w:val="single"/>
+              </w:rPr>
+            </w:pPr>
+            <w:r>
+              <w:rPr>
+                <w:b w:val="1"/>
+                <w:bCs w:val="1"/>
+                <w:sz w:val="20"/>
+                <w:szCs w:val="20"/>
+                <w:u w:val="single"/>
+              </w:rPr>
+              <w:t>Average score for Cat Swarm Optimization</w:t>
+            </w:r>
+          </w:p>
+        </w:tc>
+        <w:tc>
+          <w:tcPr>
+            <w:tcW w:w="3687" w:type="dxa"/>
+            <w:tcMar/>
+          </w:tcPr>
+          <w:p>
+            <w:pPr>
+              <w:pStyle w:val="Normal"/>
+              <w:suppressLineNumbers w:val="0"/>
+              <w:bidi w:val="0"/>
+              <w:spacing w:before="0" w:beforeAutospacing="off" w:after="0" w:afterAutospacing="off" w:line="279" w:lineRule="auto"/>
+              <w:ind w:left="0" w:right="0"/>
+              <w:jc w:val="center"/>
+              <w:rPr>
+                <w:b w:val="1"/>
+                <w:bCs w:val="1"/>
+                <w:sz w:val="20"/>
+                <w:szCs w:val="20"/>
+                <w:u w:val="single"/>
+              </w:rPr>
+            </w:pPr>
+            <w:r>
+              <w:rPr>
+                <w:b w:val="1"/>
+                <w:bCs w:val="1"/>
+                <w:sz w:val="20"/>
+                <w:szCs w:val="20"/>
+                <w:u w:val="single"/>
+              </w:rPr>
+              <w:t>Average score for Particle Swarm Optimization</w:t>
+            </w:r>
+          </w:p>
+          <w:p>
+            <w:pPr>
+              <w:bidi w:val="0"/>
+              <w:spacing w:before="0" w:beforeAutospacing="off" w:after="0" w:afterAutospacing="off"/>
+              <w:jc w:val="center"/>
+              <w:rPr>
+                <w:b w:val="1"/>
+                <w:bCs w:val="1"/>
+                <w:sz w:val="20"/>
+                <w:szCs w:val="20"/>
+                <w:u w:val="single"/>
+              </w:rPr>
+            </w:pPr>
+          </w:p>
+        </w:tc>
+      </w:tr>
+      <w:tr>
+        <w:trPr>
+          <w:trHeight w:val="300"/>
+        </w:trPr>
+        <w:tc>
+          <w:tcPr>
+            <w:tcW w:w="2340" w:type="dxa"/>
+            <w:tcMar/>
+          </w:tcPr>
+          <w:p>
+            <w:pPr>
+              <w:bidi w:val="0"/>
+              <w:spacing w:before="0" w:beforeAutospacing="off" w:after="0" w:afterAutospacing="off"/>
+              <w:rPr>
+                <w:sz w:val="20"/>
+                <w:szCs w:val="20"/>
+              </w:rPr>
+            </w:pPr>
+            <w:r>
+              <w:rPr>
+                <w:sz w:val="20"/>
+                <w:szCs w:val="20"/>
+              </w:rPr>
+              <w:t>F5</w:t>
+            </w:r>
+          </w:p>
+        </w:tc>
+        <w:tc>
+          <w:tcPr>
+            <w:tcW w:w="3360" w:type="dxa"/>
+            <w:tcMar/>
+          </w:tcPr>
+          <w:p>
+            <w:pPr>
+              <w:bidi w:val="0"/>
+              <w:spacing w:before="0" w:beforeAutospacing="off" w:after="0" w:afterAutospacing="off"/>
+              <w:jc w:val="right"/>
+              <w:rPr>
+                <w:sz w:val="20"/>
+                <w:szCs w:val="20"/>
+              </w:rPr>
+            </w:pPr>
+            <w:r>
+              <w:rPr>
+                <w:sz w:val="20"/>
+                <w:szCs w:val="20"/>
+              </w:rPr>
+              <w:t>26.81258</w:t>
+            </w:r>
+          </w:p>
+        </w:tc>
+        <w:tc>
+          <w:tcPr>
+            <w:tcW w:w="3687" w:type="dxa"/>
+            <w:tcMar/>
+          </w:tcPr>
+          <w:p>
+            <w:pPr>
+              <w:bidi w:val="0"/>
+              <w:spacing w:before="0" w:beforeAutospacing="off" w:after="0" w:afterAutospacing="off"/>
+              <w:jc w:val="right"/>
+              <w:rPr>
+                <w:sz w:val="20"/>
+                <w:szCs w:val="20"/>
+              </w:rPr>
+            </w:pPr>
+            <w:r>
+              <w:rPr>
+                <w:sz w:val="20"/>
+                <w:szCs w:val="20"/>
+              </w:rPr>
+              <w:t>96.71832</w:t>
+            </w:r>
+          </w:p>
+        </w:tc>
+      </w:tr>
+      <w:tr>
+        <w:trPr>
+          <w:trHeight w:val="300"/>
+        </w:trPr>
+        <w:tc>
+          <w:tcPr>
+            <w:tcW w:w="2340" w:type="dxa"/>
+            <w:tcMar/>
+          </w:tcPr>
+          <w:p>
+            <w:pPr>
+              <w:bidi w:val="0"/>
+              <w:spacing w:before="0" w:beforeAutospacing="off" w:after="0" w:afterAutospacing="off"/>
+              <w:rPr>
+                <w:sz w:val="20"/>
+                <w:szCs w:val="20"/>
+              </w:rPr>
+            </w:pPr>
+            <w:r>
+              <w:rPr>
+                <w:sz w:val="20"/>
+                <w:szCs w:val="20"/>
+              </w:rPr>
+              <w:t>F6</w:t>
+            </w:r>
+          </w:p>
+        </w:tc>
+        <w:tc>
+          <w:tcPr>
+            <w:tcW w:w="3360" w:type="dxa"/>
+            <w:tcMar/>
+          </w:tcPr>
+          <w:p>
+            <w:pPr>
+              <w:bidi w:val="0"/>
+              <w:spacing w:before="0" w:beforeAutospacing="off" w:after="0" w:afterAutospacing="off"/>
+              <w:jc w:val="right"/>
+              <w:rPr>
+                <w:sz w:val="20"/>
+                <w:szCs w:val="20"/>
+              </w:rPr>
+            </w:pPr>
+            <w:r>
+              <w:rPr>
+                <w:sz w:val="20"/>
+                <w:szCs w:val="20"/>
+              </w:rPr>
+              <w:t>0.816579</w:t>
+            </w:r>
+          </w:p>
+        </w:tc>
+        <w:tc>
+          <w:tcPr>
+            <w:tcW w:w="3687" w:type="dxa"/>
+            <w:tcMar/>
+          </w:tcPr>
+          <w:p>
+            <w:pPr>
+              <w:bidi w:val="0"/>
+              <w:spacing w:before="0" w:beforeAutospacing="off" w:after="0" w:afterAutospacing="off"/>
+              <w:jc w:val="right"/>
+              <w:rPr>
+                <w:sz w:val="20"/>
+                <w:szCs w:val="20"/>
+              </w:rPr>
+            </w:pPr>
+            <w:r>
+              <w:rPr>
+                <w:sz w:val="20"/>
+                <w:szCs w:val="20"/>
+              </w:rPr>
+              <w:t>0.000102</w:t>
+            </w:r>
+          </w:p>
+        </w:tc>
+      </w:tr>
+    </w:tbl>
+    <w:p>
+      <w:pPr>
+        <w:pStyle w:val="Header"/>
+        <w:tabs>
+          <w:tab w:val="center" w:leader="none" w:pos="4680"/>
+          <w:tab w:val="right" w:leader="none" w:pos="9360"/>
+        </w:tabs>
+        <w:spacing w:after="0" w:line="240" w:lineRule="auto"/>
+        <w:ind w:left="-115"/>
+        <w:jc w:val="left"/>
+        <w:rPr>
+          <w:b w:val="0"/>
+          <w:bCs w:val="0"/>
+          <w:noProof w:val="0"/>
+          <w:sz w:val="20"/>
+          <w:szCs w:val="20"/>
+          <w:u w:val="none"/>
+          <w:lang w:val="en-GB"/>
+        </w:rPr>
+      </w:pPr>
+    </w:p>
+    <w:p>
+      <w:pPr>
+        <w:pStyle w:val="Header"/>
+        <w:tabs>
+          <w:tab w:val="center" w:leader="none" w:pos="4680"/>
+          <w:tab w:val="right" w:leader="none" w:pos="9360"/>
+        </w:tabs>
+        <w:spacing w:after="0" w:line="240" w:lineRule="auto"/>
+        <w:ind w:left="-115"/>
+        <w:jc w:val="left"/>
+        <w:rPr>
+          <w:b w:val="0"/>
+          <w:bCs w:val="0"/>
+          <w:noProof w:val="0"/>
+          <w:sz w:val="20"/>
+          <w:szCs w:val="20"/>
+          <w:u w:val="none"/>
+          <w:lang w:val="en-GB"/>
+        </w:rPr>
+      </w:pPr>
+    </w:p>
+    <w:p>
+      <w:pPr>
+        <w:pStyle w:val="Header"/>
+        <w:suppressLineNumbers w:val="0"/>
+        <w:tabs>
+          <w:tab w:val="center" w:leader="none" w:pos="4680"/>
+          <w:tab w:val="right" w:leader="none" w:pos="9360"/>
+        </w:tabs>
+        <w:bidi w:val="0"/>
+        <w:spacing w:before="0" w:beforeAutospacing="off" w:after="0" w:afterAutospacing="off" w:line="240" w:lineRule="auto"/>
+        <w:ind w:left="-115" w:right="0"/>
+        <w:jc w:val="left"/>
+      </w:pPr>
+      <w:r>
+        <w:rPr>
+          <w:noProof w:val="0"/>
+          <w:sz w:val="20"/>
+          <w:szCs w:val="20"/>
+          <w:lang w:val="en-GB"/>
+        </w:rPr>
+        <w:t>These tests aim to find the lowest score</w:t>
+      </w:r>
+      <w:r>
+        <w:rPr>
+          <w:noProof w:val="0"/>
+          <w:sz w:val="20"/>
+          <w:szCs w:val="20"/>
+          <w:lang w:val="en-GB"/>
+        </w:rPr>
+        <w:t xml:space="preserve"> and the results show that the Gray Wolf Optimization</w:t>
+      </w:r>
+      <w:r>
+        <w:rPr>
+          <w:noProof w:val="0"/>
+          <w:sz w:val="20"/>
+          <w:szCs w:val="20"/>
+          <w:lang w:val="en-GB"/>
+        </w:rPr>
+        <w:t xml:space="preserve"> gives the better average result on F5, while P</w:t>
+      </w:r>
+      <w:r>
+        <w:rPr>
+          <w:noProof w:val="0"/>
+          <w:sz w:val="20"/>
+          <w:szCs w:val="20"/>
+          <w:lang w:val="en-GB"/>
+        </w:rPr>
+        <w:t>article Swarm</w:t>
+      </w:r>
+      <w:r>
+        <w:rPr>
+          <w:noProof w:val="0"/>
+          <w:sz w:val="20"/>
+          <w:szCs w:val="20"/>
+          <w:lang w:val="en-GB"/>
+        </w:rPr>
+        <w:t xml:space="preserve"> gives the better result on F6. </w:t>
+      </w:r>
+      <w:r>
+        <w:rPr>
+          <w:noProof w:val="0"/>
+          <w:sz w:val="20"/>
+          <w:szCs w:val="20"/>
+          <w:lang w:val="en-GB"/>
+        </w:rPr>
+        <w:t>It</w:t>
+      </w:r>
+      <w:r>
+        <w:rPr>
+          <w:noProof w:val="0"/>
+          <w:sz w:val="20"/>
+          <w:szCs w:val="20"/>
+          <w:lang w:val="en-GB"/>
+        </w:rPr>
+        <w:t xml:space="preserve"> shows that performance depends on the problem being tes</w:t>
+      </w:r>
+      <w:r>
+        <w:rPr>
+          <w:noProof w:val="0"/>
+          <w:sz w:val="20"/>
+          <w:szCs w:val="20"/>
+          <w:lang w:val="en-GB"/>
+        </w:rPr>
+        <w:t>ted (</w:t>
+      </w:r>
+      <w:r>
+        <w:rPr>
+          <w:noProof w:val="0"/>
+          <w:sz w:val="20"/>
+          <w:szCs w:val="20"/>
+          <w:lang w:val="en-GB"/>
+        </w:rPr>
+        <w:t>Mirj</w:t>
+      </w:r>
+      <w:r>
+        <w:rPr>
+          <w:noProof w:val="0"/>
+          <w:sz w:val="20"/>
+          <w:szCs w:val="20"/>
+          <w:lang w:val="en-GB"/>
+        </w:rPr>
+        <w:t>alili</w:t>
+      </w:r>
+      <w:r>
+        <w:rPr>
+          <w:noProof w:val="0"/>
+          <w:sz w:val="20"/>
+          <w:szCs w:val="20"/>
+          <w:lang w:val="en-GB"/>
+        </w:rPr>
+        <w:t>, Mirjalili and Lewis, 2014).</w:t>
+      </w:r>
+      <w:r>
+        <w:rPr>
+          <w:noProof w:val="0"/>
+          <w:sz w:val="20"/>
+          <w:szCs w:val="20"/>
+          <w:lang w:val="en-GB"/>
+        </w:rPr>
+        <w:t xml:space="preserve"> </w:t>
+      </w:r>
+    </w:p>
+    <w:p>
+      <w:pPr>
+        <w:pStyle w:val="Header"/>
+        <w:suppressLineNumbers w:val="0"/>
+        <w:tabs>
+          <w:tab w:val="center" w:leader="none" w:pos="4680"/>
+          <w:tab w:val="right" w:leader="none" w:pos="9360"/>
+        </w:tabs>
+        <w:bidi w:val="0"/>
+        <w:spacing w:before="0" w:beforeAutospacing="off" w:after="0" w:afterAutospacing="off" w:line="240" w:lineRule="auto"/>
+        <w:ind w:left="-115" w:right="0"/>
+        <w:jc w:val="left"/>
+        <w:rPr>
+          <w:noProof w:val="0"/>
+          <w:sz w:val="20"/>
+          <w:szCs w:val="20"/>
+          <w:lang w:val="en-GB"/>
+        </w:rPr>
+      </w:pPr>
+    </w:p>
+    <w:p>
+      <w:pPr>
+        <w:pStyle w:val="Header"/>
+        <w:suppressLineNumbers w:val="0"/>
+        <w:tabs>
+          <w:tab w:val="center" w:leader="none" w:pos="4680"/>
+          <w:tab w:val="right" w:leader="none" w:pos="9360"/>
+        </w:tabs>
+        <w:bidi w:val="0"/>
+        <w:spacing w:before="0" w:beforeAutospacing="off" w:after="0" w:afterAutospacing="off" w:line="240" w:lineRule="auto"/>
+        <w:ind w:left="-115" w:right="0"/>
+        <w:jc w:val="left"/>
+        <w:rPr>
+          <w:noProof w:val="0"/>
+          <w:sz w:val="20"/>
+          <w:szCs w:val="20"/>
+          <w:lang w:val="en-GB"/>
+        </w:rPr>
+      </w:pPr>
+      <w:r>
+        <w:rPr>
+          <w:noProof w:val="0"/>
+          <w:sz w:val="20"/>
+          <w:szCs w:val="20"/>
+          <w:lang w:val="en-GB"/>
+        </w:rPr>
+        <w:t>Overall,</w:t>
+      </w:r>
+      <w:r>
+        <w:rPr>
+          <w:noProof w:val="0"/>
+          <w:sz w:val="20"/>
+          <w:szCs w:val="20"/>
+          <w:lang w:val="en-GB"/>
+        </w:rPr>
+        <w:t xml:space="preserve"> The</w:t>
+      </w:r>
+      <w:r>
+        <w:rPr>
+          <w:noProof w:val="0"/>
+          <w:sz w:val="20"/>
+          <w:szCs w:val="20"/>
+          <w:lang w:val="en-GB"/>
+        </w:rPr>
+        <w:t xml:space="preserve"> </w:t>
+      </w:r>
+      <w:r>
+        <w:rPr>
+          <w:noProof w:val="0"/>
+          <w:sz w:val="20"/>
+          <w:szCs w:val="20"/>
+          <w:lang w:val="en-GB"/>
+        </w:rPr>
+        <w:t>authors of the Cat Swarm Optimization</w:t>
+      </w:r>
+      <w:r>
+        <w:rPr>
+          <w:noProof w:val="0"/>
+          <w:sz w:val="20"/>
+          <w:szCs w:val="20"/>
+          <w:lang w:val="en-GB"/>
+        </w:rPr>
+        <w:t xml:space="preserve"> report better results than the Particle Swarm Optimization across their six tests</w:t>
+      </w:r>
+      <w:r>
+        <w:rPr>
+          <w:noProof w:val="0"/>
+          <w:sz w:val="20"/>
+          <w:szCs w:val="20"/>
+          <w:lang w:val="en-GB"/>
+        </w:rPr>
+        <w:t xml:space="preserve">. </w:t>
+      </w:r>
+      <w:r>
+        <w:rPr>
+          <w:noProof w:val="0"/>
+          <w:sz w:val="20"/>
+          <w:szCs w:val="20"/>
+          <w:lang w:val="en-GB"/>
+        </w:rPr>
+        <w:t xml:space="preserve"> </w:t>
+      </w:r>
+      <w:r>
+        <w:rPr>
+          <w:noProof w:val="0"/>
+          <w:sz w:val="20"/>
+          <w:szCs w:val="20"/>
+          <w:lang w:val="en-GB"/>
+        </w:rPr>
+        <w:t>The Gray Wolf</w:t>
+      </w:r>
+      <w:r>
+        <w:rPr>
+          <w:noProof w:val="0"/>
+          <w:sz w:val="20"/>
+          <w:szCs w:val="20"/>
+          <w:lang w:val="en-GB"/>
+        </w:rPr>
+        <w:t xml:space="preserve"> performs better than </w:t>
+      </w:r>
+      <w:r>
+        <w:rPr>
+          <w:noProof w:val="0"/>
+          <w:sz w:val="20"/>
+          <w:szCs w:val="20"/>
+          <w:lang w:val="en-GB"/>
+        </w:rPr>
+        <w:t>Particle Swarm</w:t>
+      </w:r>
+      <w:r>
+        <w:rPr>
+          <w:noProof w:val="0"/>
+          <w:sz w:val="20"/>
+          <w:szCs w:val="20"/>
+          <w:lang w:val="en-GB"/>
+        </w:rPr>
+        <w:t xml:space="preserve"> on some tests, but </w:t>
+      </w:r>
+      <w:r>
+        <w:rPr>
+          <w:noProof w:val="0"/>
+          <w:sz w:val="20"/>
+          <w:szCs w:val="20"/>
+          <w:lang w:val="en-GB"/>
+        </w:rPr>
+        <w:t>Particle Swarm</w:t>
+      </w:r>
+      <w:r>
+        <w:rPr>
+          <w:noProof w:val="0"/>
+          <w:sz w:val="20"/>
+          <w:szCs w:val="20"/>
+          <w:lang w:val="en-GB"/>
+        </w:rPr>
+        <w:t xml:space="preserve"> performs better on others</w:t>
+      </w:r>
+      <w:r>
+        <w:rPr>
+          <w:noProof w:val="0"/>
+          <w:sz w:val="20"/>
+          <w:szCs w:val="20"/>
+          <w:lang w:val="en-GB"/>
+        </w:rPr>
+        <w:t>, which</w:t>
+      </w:r>
+      <w:r>
+        <w:rPr>
+          <w:noProof w:val="0"/>
+          <w:sz w:val="20"/>
+          <w:szCs w:val="20"/>
+          <w:lang w:val="en-GB"/>
+        </w:rPr>
+        <w:t xml:space="preserve"> shows that an algorithm’s performance depends on the problem. </w:t>
+      </w:r>
+      <w:r>
+        <w:rPr>
+          <w:noProof w:val="0"/>
+          <w:sz w:val="20"/>
+          <w:szCs w:val="20"/>
+          <w:lang w:val="en-GB"/>
+        </w:rPr>
+        <w:t xml:space="preserve">This means you </w:t>
+      </w:r>
+      <w:r>
+        <w:rPr>
+          <w:noProof w:val="0"/>
+          <w:sz w:val="20"/>
+          <w:szCs w:val="20"/>
+          <w:lang w:val="en-GB"/>
+        </w:rPr>
+        <w:t>cannot directly compare C</w:t>
+      </w:r>
+      <w:r>
+        <w:rPr>
+          <w:noProof w:val="0"/>
+          <w:sz w:val="20"/>
+          <w:szCs w:val="20"/>
+          <w:lang w:val="en-GB"/>
+        </w:rPr>
+        <w:t>at Swarm Optimization</w:t>
+      </w:r>
+      <w:r>
+        <w:rPr>
+          <w:noProof w:val="0"/>
+          <w:sz w:val="20"/>
+          <w:szCs w:val="20"/>
+          <w:lang w:val="en-GB"/>
+        </w:rPr>
+        <w:t xml:space="preserve"> with </w:t>
+      </w:r>
+      <w:r>
+        <w:rPr>
+          <w:noProof w:val="0"/>
+          <w:sz w:val="20"/>
+          <w:szCs w:val="20"/>
+          <w:lang w:val="en-GB"/>
+        </w:rPr>
+        <w:t xml:space="preserve">Grand Wolf Optimization </w:t>
+      </w:r>
+      <w:r>
+        <w:rPr>
+          <w:noProof w:val="0"/>
+          <w:sz w:val="20"/>
+          <w:szCs w:val="20"/>
+          <w:lang w:val="en-GB"/>
+        </w:rPr>
+        <w:t xml:space="preserve">because the </w:t>
+      </w:r>
+      <w:r>
+        <w:rPr>
+          <w:noProof w:val="0"/>
+          <w:sz w:val="20"/>
+          <w:szCs w:val="20"/>
+          <w:lang w:val="en-GB"/>
+        </w:rPr>
+        <w:t xml:space="preserve">papers </w:t>
+      </w:r>
+      <w:r>
+        <w:rPr>
+          <w:noProof w:val="0"/>
+          <w:sz w:val="20"/>
+          <w:szCs w:val="20"/>
+          <w:lang w:val="en-GB"/>
+        </w:rPr>
+        <w:t>state</w:t>
+      </w:r>
+      <w:r>
+        <w:rPr>
+          <w:noProof w:val="0"/>
+          <w:sz w:val="20"/>
+          <w:szCs w:val="20"/>
+          <w:lang w:val="en-GB"/>
+        </w:rPr>
+        <w:t xml:space="preserve"> that </w:t>
+      </w:r>
+      <w:r>
+        <w:rPr>
+          <w:noProof w:val="0"/>
+          <w:sz w:val="20"/>
+          <w:szCs w:val="20"/>
+          <w:lang w:val="en-GB"/>
+        </w:rPr>
+        <w:t>different test settings</w:t>
+      </w:r>
+      <w:r>
+        <w:rPr>
+          <w:noProof w:val="0"/>
+          <w:sz w:val="20"/>
+          <w:szCs w:val="20"/>
+          <w:lang w:val="en-GB"/>
+        </w:rPr>
+        <w:t xml:space="preserve"> are used</w:t>
+      </w:r>
+      <w:r>
+        <w:rPr>
+          <w:noProof w:val="0"/>
+          <w:sz w:val="20"/>
+          <w:szCs w:val="20"/>
+          <w:lang w:val="en-GB"/>
+        </w:rPr>
+        <w:t>.</w:t>
+      </w:r>
+    </w:p>
     <w:sectPr>
       <w:pgSz w:w="12240" w:h="15840" w:orient="portrait"/>
       <w:pgMar w:top="1440" w:right="1440" w:bottom="1440" w:left="1440" w:header="720" w:footer="720" w:gutter="0"/>
       <w:cols w:space="720"/>
       <w:docGrid w:linePitch="360"/>
-      <w:headerReference w:type="default" r:id="R70bfbf8e44944076"/>
-      <w:footerReference w:type="default" r:id="R0e62ec24a8f94464"/>
+      <w:headerReference w:type="default" r:id="R73c9b1b017524287"/>
+      <w:footerReference w:type="default" r:id="Rb36f984416094703"/>
     </w:sectPr>
   </w:body>
 </w:document>
@@ -1712,7 +2836,7 @@
     <w:name w:val="Hyperlink"/>
     <w:basedOn w:val="DefaultParagraphFont"/>
     <w:unhideWhenUsed/>
-    <w:rsid w:val="2D8604D3"/>
+    <w:rsid w:val="61B7C810"/>
     <w:rPr>
       <w:color w:val="467886"/>
       <w:u w:val="single"/>
@@ -1723,7 +2847,7 @@
     <w:name w:val="header"/>
     <w:basedOn w:val="Normal"/>
     <w:unhideWhenUsed/>
-    <w:rsid w:val="2D8604D3"/>
+    <w:rsid w:val="61B7C810"/>
     <w:pPr>
       <w:tabs>
         <w:tab w:val="center" w:leader="none" w:pos="4680"/>
@@ -1737,7 +2861,7 @@
     <w:name w:val="footer"/>
     <w:basedOn w:val="Normal"/>
     <w:unhideWhenUsed/>
-    <w:rsid w:val="2D8604D3"/>
+    <w:rsid w:val="61B7C810"/>
     <w:pPr>
       <w:tabs>
         <w:tab w:val="center" w:leader="none" w:pos="4680"/>

</xml_diff>

<commit_message>
Complete Q5 comparison and references
</commit_message>
<xml_diff>
--- a/Q5_swarm_algorithms.docx
+++ b/Q5_swarm_algorithms.docx
@@ -387,14 +387,6 @@
         <w:spacing w:after="0" w:line="240" w:lineRule="auto"/>
         <w:ind w:left="-115"/>
         <w:jc w:val="left"/>
-        <w:rPr>
-          <w:b w:val="0"/>
-          <w:bCs w:val="0"/>
-          <w:noProof w:val="0"/>
-          <w:sz w:val="20"/>
-          <w:szCs w:val="20"/>
-          <w:lang w:val="en-GB"/>
-        </w:rPr>
       </w:pPr>
       <w:r>
         <w:rPr>
@@ -692,7 +684,18 @@
           <w:szCs w:val="20"/>
           <w:lang w:val="en-GB"/>
         </w:rPr>
-        <w:t xml:space="preserve"> a cat chasing a target</w:t>
+        <w:t xml:space="preserve"> a cat chasin</w:t>
+      </w:r>
+      <w:r>
+        <w:rPr>
+          <w:b w:val="0"/>
+          <w:bCs w:val="0"/>
+          <w:noProof w:val="0"/>
+          <w:sz w:val="20"/>
+          <w:szCs w:val="20"/>
+          <w:lang w:val="en-GB"/>
+        </w:rPr>
+        <w:t>g a target</w:t>
       </w:r>
       <w:r>
         <w:rPr>
@@ -725,7 +728,45 @@
           <w:szCs w:val="20"/>
           <w:lang w:val="en-GB"/>
         </w:rPr>
-        <w:t xml:space="preserve">at that time. </w:t>
+        <w:t>at that time</w:t>
+      </w:r>
+      <w:r>
+        <w:rPr>
+          <w:b w:val="0"/>
+          <w:bCs w:val="0"/>
+          <w:noProof w:val="0"/>
+          <w:sz w:val="20"/>
+          <w:szCs w:val="20"/>
+          <w:lang w:val="en-GB"/>
+        </w:rPr>
+        <w:t xml:space="preserve"> </w:t>
+      </w:r>
+      <w:r>
+        <w:rPr>
+          <w:noProof w:val="0"/>
+          <w:sz w:val="20"/>
+          <w:szCs w:val="20"/>
+          <w:lang w:val="en-GB"/>
+        </w:rPr>
+        <w:t xml:space="preserve">(Chu, </w:t>
+      </w:r>
+      <w:r>
+        <w:rPr>
+          <w:noProof w:val="0"/>
+          <w:sz w:val="20"/>
+          <w:szCs w:val="20"/>
+          <w:lang w:val="en-GB"/>
+        </w:rPr>
+        <w:t>Tsai</w:t>
+      </w:r>
+      <w:r>
+        <w:rPr>
+          <w:noProof w:val="0"/>
+          <w:sz w:val="20"/>
+          <w:szCs w:val="20"/>
+          <w:lang w:val="en-GB"/>
+        </w:rPr>
+        <w:t xml:space="preserve"> and Pan, 2006).</w:t>
       </w:r>
     </w:p>
     <w:p>
@@ -1140,7 +1181,19 @@
           <w:u w:val="none"/>
           <w:lang w:val="en-GB"/>
         </w:rPr>
-        <w:t xml:space="preserve">ovements become smaller as the search progresses. This helps the wolves focus on improving </w:t>
+        <w:t>ovements become smaller as t</w:t>
+      </w:r>
+      <w:r>
+        <w:rPr>
+          <w:b w:val="0"/>
+          <w:bCs w:val="0"/>
+          <w:noProof w:val="0"/>
+          <w:sz w:val="20"/>
+          <w:szCs w:val="20"/>
+          <w:u w:val="none"/>
+          <w:lang w:val="en-GB"/>
+        </w:rPr>
+        <w:t xml:space="preserve">he search progresses. This helps the wolves focus on improving </w:t>
       </w:r>
       <w:r>
         <w:rPr>
@@ -1200,7 +1253,34 @@
           <w:u w:val="none"/>
           <w:lang w:val="en-GB"/>
         </w:rPr>
-        <w:t xml:space="preserve">. </w:t>
+        <w:t xml:space="preserve"> </w:t>
+      </w:r>
+      <w:r>
+        <w:rPr>
+          <w:noProof w:val="0"/>
+          <w:sz w:val="20"/>
+          <w:szCs w:val="20"/>
+          <w:lang w:val="en-GB"/>
+        </w:rPr>
+        <w:t>(</w:t>
+      </w:r>
+      <w:r>
+        <w:rPr>
+          <w:noProof w:val="0"/>
+          <w:sz w:val="20"/>
+          <w:szCs w:val="20"/>
+          <w:lang w:val="en-GB"/>
+        </w:rPr>
+        <w:t>Mirjalili</w:t>
+      </w:r>
+      <w:r>
+        <w:rPr>
+          <w:noProof w:val="0"/>
+          <w:sz w:val="20"/>
+          <w:szCs w:val="20"/>
+          <w:lang w:val="en-GB"/>
+        </w:rPr>
+        <w:t>, Mirjalili and Lewis, 2014).</w:t>
       </w:r>
     </w:p>
     <w:p>
@@ -1635,8 +1715,25 @@
                 <w:szCs w:val="20"/>
                 <w:u w:val="single"/>
               </w:rPr>
-              <w:t>Average score for Cat Swarm Optimization</w:t>
+              <w:t>Average score for Gray Wolf Optimization</w:t>
             </w:r>
+          </w:p>
+          <w:p>
+            <w:pPr>
+              <w:pStyle w:val="Normal"/>
+              <w:suppressLineNumbers w:val="0"/>
+              <w:bidi w:val="0"/>
+              <w:spacing w:before="0" w:beforeAutospacing="off" w:after="0" w:afterAutospacing="off" w:line="279" w:lineRule="auto"/>
+              <w:ind w:left="0" w:right="0"/>
+              <w:jc w:val="center"/>
+              <w:rPr>
+                <w:b w:val="1"/>
+                <w:bCs w:val="1"/>
+                <w:sz w:val="20"/>
+                <w:szCs w:val="20"/>
+                <w:u w:val="single"/>
+              </w:rPr>
+            </w:pPr>
           </w:p>
         </w:tc>
         <w:tc>
@@ -1648,7 +1745,6 @@
             <w:pPr>
               <w:pStyle w:val="Normal"/>
               <w:suppressLineNumbers w:val="0"/>
-              <w:bidi w:val="0"/>
               <w:spacing w:before="0" w:beforeAutospacing="off" w:after="0" w:afterAutospacing="off" w:line="279" w:lineRule="auto"/>
               <w:ind w:left="0" w:right="0"/>
               <w:jc w:val="center"/>
@@ -1668,7 +1764,27 @@
                 <w:szCs w:val="20"/>
                 <w:u w:val="single"/>
               </w:rPr>
-              <w:t>Average score for Particle Swarm Optimization</w:t>
+              <w:t>Average score for</w:t>
+            </w:r>
+            <w:r>
+              <w:rPr>
+                <w:b w:val="1"/>
+                <w:bCs w:val="1"/>
+                <w:sz w:val="20"/>
+                <w:szCs w:val="20"/>
+                <w:u w:val="single"/>
+              </w:rPr>
+              <w:t xml:space="preserve"> Particle Swarm</w:t>
+            </w:r>
+            <w:r>
+              <w:rPr>
+                <w:b w:val="1"/>
+                <w:bCs w:val="1"/>
+                <w:sz w:val="20"/>
+                <w:szCs w:val="20"/>
+                <w:u w:val="single"/>
+              </w:rPr>
+              <w:t xml:space="preserve"> Optimization</w:t>
             </w:r>
           </w:p>
           <w:p>
@@ -2036,12 +2152,6 @@
         <w:spacing w:before="0" w:beforeAutospacing="off" w:after="0" w:afterAutospacing="off" w:line="240" w:lineRule="auto"/>
         <w:ind w:left="-115" w:right="0"/>
         <w:jc w:val="left"/>
-        <w:rPr>
-          <w:noProof w:val="0"/>
-          <w:sz w:val="20"/>
-          <w:szCs w:val="20"/>
-          <w:lang w:val="en-GB"/>
-        </w:rPr>
       </w:pPr>
       <w:r>
         <w:rPr>
@@ -2221,7 +2331,25 @@
           <w:szCs w:val="20"/>
           <w:lang w:val="en-GB"/>
         </w:rPr>
-        <w:t xml:space="preserve">Grand Wolf Optimization </w:t>
+        <w:t>Gra</w:t>
+      </w:r>
+      <w:r>
+        <w:rPr>
+          <w:noProof w:val="0"/>
+          <w:sz w:val="20"/>
+          <w:szCs w:val="20"/>
+          <w:lang w:val="en-GB"/>
+        </w:rPr>
+        <w:t xml:space="preserve">y </w:t>
+      </w:r>
+      <w:r>
+        <w:rPr>
+          <w:noProof w:val="0"/>
+          <w:sz w:val="20"/>
+          <w:szCs w:val="20"/>
+          <w:lang w:val="en-GB"/>
+        </w:rPr>
+        <w:t xml:space="preserve">Wolf Optimization </w:t>
       </w:r>
       <w:r>
         <w:rPr>
@@ -2285,6 +2413,167 @@
           <w:lang w:val="en-GB"/>
         </w:rPr>
         <w:t>.</w:t>
+      </w:r>
+    </w:p>
+    <w:p>
+      <w:pPr>
+        <w:pStyle w:val="Header"/>
+        <w:suppressLineNumbers w:val="0"/>
+        <w:tabs>
+          <w:tab w:val="center" w:leader="none" w:pos="4680"/>
+          <w:tab w:val="right" w:leader="none" w:pos="9360"/>
+        </w:tabs>
+        <w:bidi w:val="0"/>
+        <w:spacing w:before="0" w:beforeAutospacing="off" w:after="0" w:afterAutospacing="off" w:line="240" w:lineRule="auto"/>
+        <w:ind w:left="-115" w:right="0"/>
+        <w:jc w:val="left"/>
+        <w:rPr>
+          <w:noProof w:val="0"/>
+          <w:sz w:val="20"/>
+          <w:szCs w:val="20"/>
+          <w:lang w:val="en-GB"/>
+        </w:rPr>
+      </w:pPr>
+    </w:p>
+    <w:p>
+      <w:pPr>
+        <w:pStyle w:val="Header"/>
+        <w:suppressLineNumbers w:val="0"/>
+        <w:tabs>
+          <w:tab w:val="center" w:leader="none" w:pos="4680"/>
+          <w:tab w:val="right" w:leader="none" w:pos="9360"/>
+        </w:tabs>
+        <w:bidi w:val="0"/>
+        <w:spacing w:before="0" w:beforeAutospacing="off" w:after="0" w:afterAutospacing="off" w:line="240" w:lineRule="auto"/>
+        <w:ind w:left="-115" w:right="0"/>
+        <w:jc w:val="left"/>
+        <w:rPr>
+          <w:b w:val="1"/>
+          <w:bCs w:val="1"/>
+          <w:noProof w:val="0"/>
+          <w:sz w:val="24"/>
+          <w:szCs w:val="24"/>
+          <w:u w:val="single"/>
+          <w:lang w:val="en-GB"/>
+        </w:rPr>
+      </w:pPr>
+      <w:r>
+        <w:rPr>
+          <w:b w:val="1"/>
+          <w:bCs w:val="1"/>
+          <w:noProof w:val="0"/>
+          <w:sz w:val="24"/>
+          <w:szCs w:val="24"/>
+          <w:u w:val="single"/>
+          <w:lang w:val="en-GB"/>
+        </w:rPr>
+        <w:t>References</w:t>
+      </w:r>
+    </w:p>
+    <w:p>
+      <w:pPr>
+        <w:pStyle w:val="Header"/>
+        <w:suppressLineNumbers w:val="0"/>
+        <w:tabs>
+          <w:tab w:val="center" w:leader="none" w:pos="4680"/>
+          <w:tab w:val="right" w:leader="none" w:pos="9360"/>
+        </w:tabs>
+        <w:bidi w:val="0"/>
+        <w:spacing w:before="0" w:beforeAutospacing="off" w:after="0" w:afterAutospacing="off" w:line="240" w:lineRule="auto"/>
+        <w:ind w:left="-115" w:right="0"/>
+        <w:jc w:val="left"/>
+        <w:rPr>
+          <w:noProof w:val="0"/>
+          <w:sz w:val="20"/>
+          <w:szCs w:val="20"/>
+          <w:lang w:val="en-GB"/>
+        </w:rPr>
+      </w:pPr>
+    </w:p>
+    <w:p>
+      <w:pPr>
+        <w:pStyle w:val="Header"/>
+        <w:tabs>
+          <w:tab w:val="center" w:leader="none" w:pos="4680"/>
+          <w:tab w:val="right" w:leader="none" w:pos="9360"/>
+        </w:tabs>
+        <w:bidi w:val="0"/>
+        <w:spacing w:before="0" w:beforeAutospacing="off" w:after="0" w:afterAutospacing="off" w:line="240" w:lineRule="auto"/>
+        <w:ind w:left="-115" w:right="0"/>
+        <w:jc w:val="left"/>
+      </w:pPr>
+      <w:r>
+        <w:rPr>
+          <w:noProof w:val="0"/>
+          <w:sz w:val="20"/>
+          <w:szCs w:val="20"/>
+          <w:lang w:val="en-GB"/>
+        </w:rPr>
+        <w:t xml:space="preserve">Chu, S.-C., Tsai, P.-W. and Pan, J.-S. (2006) ‘Cat swarm optimization’, in Yang, Q. and Webb, G. (eds.) PRICAI 2006: Trends in Artificial Intelligence. Berlin, Heidelberg: Springer, pp. 854–858. Available at: </w:t>
+      </w:r>
+      <w:hyperlink r:id="R78d332f7281640cd">
+        <w:r>
+          <w:rPr>
+            <w:noProof w:val="0"/>
+            <w:sz w:val="20"/>
+            <w:szCs w:val="20"/>
+            <w:lang w:val="en-GB"/>
+          </w:rPr>
+          <w:t>https://doi.org/10.1007/11801603_94</w:t>
+        </w:r>
+      </w:hyperlink>
+      <w:r>
+        <w:rPr>
+          <w:noProof w:val="0"/>
+          <w:sz w:val="20"/>
+          <w:szCs w:val="20"/>
+          <w:lang w:val="en-GB"/>
+        </w:rPr>
+        <w:t>.</w:t>
+      </w:r>
+    </w:p>
+    <w:p>
+      <w:pPr>
+        <w:pStyle w:val="Header"/>
+        <w:tabs>
+          <w:tab w:val="center" w:leader="none" w:pos="4680"/>
+          <w:tab w:val="right" w:leader="none" w:pos="9360"/>
+        </w:tabs>
+        <w:bidi w:val="0"/>
+        <w:spacing w:before="0" w:beforeAutospacing="off" w:after="0" w:afterAutospacing="off" w:line="240" w:lineRule="auto"/>
+        <w:ind w:left="-115" w:right="0"/>
+        <w:jc w:val="left"/>
+      </w:pPr>
+      <w:r>
+        <w:rPr>
+          <w:noProof w:val="0"/>
+          <w:sz w:val="20"/>
+          <w:szCs w:val="20"/>
+          <w:lang w:val="en-GB"/>
+        </w:rPr>
+        <w:t xml:space="preserve"> </w:t>
+      </w:r>
+    </w:p>
+    <w:p>
+      <w:pPr>
+        <w:pStyle w:val="Header"/>
+        <w:tabs>
+          <w:tab w:val="center" w:leader="none" w:pos="4680"/>
+          <w:tab w:val="right" w:leader="none" w:pos="9360"/>
+        </w:tabs>
+        <w:bidi w:val="0"/>
+        <w:spacing w:before="0" w:beforeAutospacing="off" w:after="0" w:afterAutospacing="off" w:line="240" w:lineRule="auto"/>
+        <w:ind w:left="-115" w:right="0"/>
+        <w:jc w:val="left"/>
+      </w:pPr>
+      <w:r>
+        <w:rPr>
+          <w:noProof w:val="0"/>
+          <w:sz w:val="20"/>
+          <w:szCs w:val="20"/>
+          <w:lang w:val="en-GB"/>
+        </w:rPr>
+        <w:t>Mirjalili, S., Mirjalili, S.M. and Lewis, A. (2014) ‘Grey Wolf Optimizer’, Advances in Engineering Software, 69, pp. 46–61. Available at: https://doi.org/10.1016/j.advengsoft.2013.12.007.</w:t>
       </w:r>
     </w:p>
     <w:sectPr>

</xml_diff>